<commit_message>
Update design and testing documentation
</commit_message>
<xml_diff>
--- a/documentation/design/UI_Design_Document.docx
+++ b/documentation/design/UI_Design_Document.docx
@@ -49,51 +49,7 @@
           <w:sz w:val="20"/>
           <w:szCs w:val="20"/>
         </w:rPr>
-        <w:t xml:space="preserve">“The Morning Rush — The Roast </w:t>
-      </w:r>
-      <w:proofErr w:type="gramStart"/>
-      <w:r>
-        <w:rPr>
-          <w:i/>
-          <w:iCs/>
-          <w:color w:val="5B4636"/>
-          <w:sz w:val="20"/>
-          <w:szCs w:val="20"/>
-        </w:rPr>
-        <w:t>Report”  |</w:t>
-      </w:r>
-      <w:proofErr w:type="gramEnd"/>
-      <w:r>
-        <w:rPr>
-          <w:i/>
-          <w:iCs/>
-          <w:color w:val="5B4636"/>
-          <w:sz w:val="20"/>
-          <w:szCs w:val="20"/>
-        </w:rPr>
-        <w:t xml:space="preserve">  January–June </w:t>
-      </w:r>
-      <w:proofErr w:type="gramStart"/>
-      <w:r>
-        <w:rPr>
-          <w:i/>
-          <w:iCs/>
-          <w:color w:val="5B4636"/>
-          <w:sz w:val="20"/>
-          <w:szCs w:val="20"/>
-        </w:rPr>
-        <w:t>2023  |</w:t>
-      </w:r>
-      <w:proofErr w:type="gramEnd"/>
-      <w:r>
-        <w:rPr>
-          <w:i/>
-          <w:iCs/>
-          <w:color w:val="5B4636"/>
-          <w:sz w:val="20"/>
-          <w:szCs w:val="20"/>
-        </w:rPr>
-        <w:t xml:space="preserve">  Astoria · Hell’s Kitchen · Lower Manhattan</w:t>
+        <w:t>“The Morning Rush — The Roast Report”  |  January–June 2023  |  Astoria · Hell’s Kitchen · Lower Manhattan</w:t>
       </w:r>
     </w:p>
     <w:tbl>
@@ -119,12 +75,6 @@
         <w:gridCol w:w="3240"/>
       </w:tblGrid>
       <w:tr>
-        <w:tblPrEx>
-          <w:tblCellMar>
-            <w:top w:w="0" w:type="dxa"/>
-            <w:bottom w:w="0" w:type="dxa"/>
-          </w:tblCellMar>
-        </w:tblPrEx>
         <w:tc>
           <w:tcPr>
             <w:tcW w:w="3240" w:type="dxa"/>
@@ -358,12 +308,6 @@
         <w:gridCol w:w="4420"/>
       </w:tblGrid>
       <w:tr>
-        <w:tblPrEx>
-          <w:tblCellMar>
-            <w:top w:w="0" w:type="dxa"/>
-            <w:bottom w:w="0" w:type="dxa"/>
-          </w:tblCellMar>
-        </w:tblPrEx>
         <w:trPr>
           <w:cantSplit/>
           <w:tblHeader/>
@@ -472,12 +416,6 @@
         </w:tc>
       </w:tr>
       <w:tr>
-        <w:tblPrEx>
-          <w:tblCellMar>
-            <w:top w:w="0" w:type="dxa"/>
-            <w:bottom w:w="0" w:type="dxa"/>
-          </w:tblCellMar>
-        </w:tblPrEx>
         <w:trPr>
           <w:cantSplit/>
         </w:trPr>
@@ -576,12 +514,6 @@
         </w:tc>
       </w:tr>
       <w:tr>
-        <w:tblPrEx>
-          <w:tblCellMar>
-            <w:top w:w="0" w:type="dxa"/>
-            <w:bottom w:w="0" w:type="dxa"/>
-          </w:tblCellMar>
-        </w:tblPrEx>
         <w:trPr>
           <w:cantSplit/>
         </w:trPr>
@@ -689,12 +621,6 @@
         </w:tc>
       </w:tr>
       <w:tr>
-        <w:tblPrEx>
-          <w:tblCellMar>
-            <w:top w:w="0" w:type="dxa"/>
-            <w:bottom w:w="0" w:type="dxa"/>
-          </w:tblCellMar>
-        </w:tblPrEx>
         <w:trPr>
           <w:cantSplit/>
         </w:trPr>
@@ -793,12 +719,6 @@
         </w:tc>
       </w:tr>
       <w:tr>
-        <w:tblPrEx>
-          <w:tblCellMar>
-            <w:top w:w="0" w:type="dxa"/>
-            <w:bottom w:w="0" w:type="dxa"/>
-          </w:tblCellMar>
-        </w:tblPrEx>
         <w:trPr>
           <w:cantSplit/>
         </w:trPr>
@@ -1004,12 +924,6 @@
         <w:gridCol w:w="3000"/>
       </w:tblGrid>
       <w:tr>
-        <w:tblPrEx>
-          <w:tblCellMar>
-            <w:top w:w="0" w:type="dxa"/>
-            <w:bottom w:w="0" w:type="dxa"/>
-          </w:tblCellMar>
-        </w:tblPrEx>
         <w:trPr>
           <w:cantSplit/>
           <w:tblHeader/>
@@ -1118,12 +1032,6 @@
         </w:tc>
       </w:tr>
       <w:tr>
-        <w:tblPrEx>
-          <w:tblCellMar>
-            <w:top w:w="0" w:type="dxa"/>
-            <w:bottom w:w="0" w:type="dxa"/>
-          </w:tblCellMar>
-        </w:tblPrEx>
         <w:trPr>
           <w:cantSplit/>
         </w:trPr>
@@ -1222,12 +1130,6 @@
         </w:tc>
       </w:tr>
       <w:tr>
-        <w:tblPrEx>
-          <w:tblCellMar>
-            <w:top w:w="0" w:type="dxa"/>
-            <w:bottom w:w="0" w:type="dxa"/>
-          </w:tblCellMar>
-        </w:tblPrEx>
         <w:trPr>
           <w:cantSplit/>
         </w:trPr>
@@ -1326,12 +1228,6 @@
         </w:tc>
       </w:tr>
       <w:tr>
-        <w:tblPrEx>
-          <w:tblCellMar>
-            <w:top w:w="0" w:type="dxa"/>
-            <w:bottom w:w="0" w:type="dxa"/>
-          </w:tblCellMar>
-        </w:tblPrEx>
         <w:trPr>
           <w:cantSplit/>
         </w:trPr>
@@ -1527,15 +1423,7 @@
         <w:t>color</w:t>
       </w:r>
       <w:r>
-        <w:t xml:space="preserve"> code, one </w:t>
-      </w:r>
-      <w:proofErr w:type="gramStart"/>
-      <w:r>
-        <w:t>type</w:t>
-      </w:r>
-      <w:proofErr w:type="gramEnd"/>
-      <w:r>
-        <w:t xml:space="preserve"> system and one interaction style across all charts (Minutes §6, Interaction consistency).</w:t>
+        <w:t xml:space="preserve"> code, one type system and one interaction style across all charts (Minutes §6, Interaction consistency).</w:t>
       </w:r>
     </w:p>
     <w:p>
@@ -1555,15 +1443,7 @@
         <w:t>Read anywhere.</w:t>
       </w:r>
       <w:r>
-        <w:t xml:space="preserve"> Light and dark themes, a fluid layout and keyboard support are design </w:t>
-      </w:r>
-      <w:proofErr w:type="gramStart"/>
-      <w:r>
-        <w:t>requirements in their own right</w:t>
-      </w:r>
-      <w:proofErr w:type="gramEnd"/>
-      <w:r>
-        <w:t xml:space="preserve"> (Rationale §3, §7).</w:t>
+        <w:t xml:space="preserve"> Light and dark themes, a fluid layout and keyboard support are design requirements in their own right (Rationale §3, §7).</w:t>
       </w:r>
     </w:p>
     <w:p>
@@ -1661,12 +1541,6 @@
         <w:gridCol w:w="3820"/>
       </w:tblGrid>
       <w:tr>
-        <w:tblPrEx>
-          <w:tblCellMar>
-            <w:top w:w="0" w:type="dxa"/>
-            <w:bottom w:w="0" w:type="dxa"/>
-          </w:tblCellMar>
-        </w:tblPrEx>
         <w:trPr>
           <w:cantSplit/>
           <w:tblHeader/>
@@ -1843,12 +1717,6 @@
         </w:tc>
       </w:tr>
       <w:tr>
-        <w:tblPrEx>
-          <w:tblCellMar>
-            <w:top w:w="0" w:type="dxa"/>
-            <w:bottom w:w="0" w:type="dxa"/>
-          </w:tblCellMar>
-        </w:tblPrEx>
         <w:trPr>
           <w:cantSplit/>
         </w:trPr>
@@ -2017,12 +1885,6 @@
         </w:tc>
       </w:tr>
       <w:tr>
-        <w:tblPrEx>
-          <w:tblCellMar>
-            <w:top w:w="0" w:type="dxa"/>
-            <w:bottom w:w="0" w:type="dxa"/>
-          </w:tblCellMar>
-        </w:tblPrEx>
         <w:trPr>
           <w:cantSplit/>
         </w:trPr>
@@ -2175,12 +2037,6 @@
         </w:tc>
       </w:tr>
       <w:tr>
-        <w:tblPrEx>
-          <w:tblCellMar>
-            <w:top w:w="0" w:type="dxa"/>
-            <w:bottom w:w="0" w:type="dxa"/>
-          </w:tblCellMar>
-        </w:tblPrEx>
         <w:trPr>
           <w:cantSplit/>
         </w:trPr>
@@ -2333,12 +2189,6 @@
         </w:tc>
       </w:tr>
       <w:tr>
-        <w:tblPrEx>
-          <w:tblCellMar>
-            <w:top w:w="0" w:type="dxa"/>
-            <w:bottom w:w="0" w:type="dxa"/>
-          </w:tblCellMar>
-        </w:tblPrEx>
         <w:trPr>
           <w:cantSplit/>
         </w:trPr>
@@ -2507,12 +2357,6 @@
         </w:tc>
       </w:tr>
       <w:tr>
-        <w:tblPrEx>
-          <w:tblCellMar>
-            <w:top w:w="0" w:type="dxa"/>
-            <w:bottom w:w="0" w:type="dxa"/>
-          </w:tblCellMar>
-        </w:tblPrEx>
         <w:trPr>
           <w:cantSplit/>
         </w:trPr>
@@ -2665,12 +2509,6 @@
         </w:tc>
       </w:tr>
       <w:tr>
-        <w:tblPrEx>
-          <w:tblCellMar>
-            <w:top w:w="0" w:type="dxa"/>
-            <w:bottom w:w="0" w:type="dxa"/>
-          </w:tblCellMar>
-        </w:tblPrEx>
         <w:trPr>
           <w:cantSplit/>
         </w:trPr>
@@ -2823,12 +2661,6 @@
         </w:tc>
       </w:tr>
       <w:tr>
-        <w:tblPrEx>
-          <w:tblCellMar>
-            <w:top w:w="0" w:type="dxa"/>
-            <w:bottom w:w="0" w:type="dxa"/>
-          </w:tblCellMar>
-        </w:tblPrEx>
         <w:trPr>
           <w:cantSplit/>
         </w:trPr>
@@ -2990,12 +2822,6 @@
         </w:tc>
       </w:tr>
       <w:tr>
-        <w:tblPrEx>
-          <w:tblCellMar>
-            <w:top w:w="0" w:type="dxa"/>
-            <w:bottom w:w="0" w:type="dxa"/>
-          </w:tblCellMar>
-        </w:tblPrEx>
         <w:trPr>
           <w:cantSplit/>
         </w:trPr>
@@ -3148,12 +2974,6 @@
         </w:tc>
       </w:tr>
       <w:tr>
-        <w:tblPrEx>
-          <w:tblCellMar>
-            <w:top w:w="0" w:type="dxa"/>
-            <w:bottom w:w="0" w:type="dxa"/>
-          </w:tblCellMar>
-        </w:tblPrEx>
         <w:trPr>
           <w:cantSplit/>
         </w:trPr>
@@ -3304,32 +3124,17 @@
             <w:pPr>
               <w:spacing w:after="30"/>
             </w:pPr>
-            <w:proofErr w:type="gramStart"/>
-            <w:r>
-              <w:rPr>
-                <w:sz w:val="18"/>
-                <w:szCs w:val="18"/>
-              </w:rPr>
-              <w:t>Teal</w:t>
-            </w:r>
-            <w:proofErr w:type="gramEnd"/>
-            <w:r>
-              <w:rPr>
-                <w:sz w:val="18"/>
-                <w:szCs w:val="18"/>
-              </w:rPr>
-              <w:t>: map circle, ranking bar, scatter points</w:t>
+            <w:r>
+              <w:rPr>
+                <w:sz w:val="18"/>
+                <w:szCs w:val="18"/>
+              </w:rPr>
+              <w:t>Teal: map circle, ranking bar, scatter points</w:t>
             </w:r>
           </w:p>
         </w:tc>
       </w:tr>
       <w:tr>
-        <w:tblPrEx>
-          <w:tblCellMar>
-            <w:top w:w="0" w:type="dxa"/>
-            <w:bottom w:w="0" w:type="dxa"/>
-          </w:tblCellMar>
-        </w:tblPrEx>
         <w:trPr>
           <w:cantSplit/>
         </w:trPr>
@@ -3512,17 +3317,7 @@
           <w:sz w:val="22"/>
           <w:szCs w:val="22"/>
         </w:rPr>
-        <w:t>Color</w:t>
-      </w:r>
-      <w:r>
-        <w:rPr>
-          <w:b/>
-          <w:bCs/>
-          <w:color w:val="2A1A10"/>
-          <w:sz w:val="22"/>
-          <w:szCs w:val="22"/>
-        </w:rPr>
-        <w:t xml:space="preserve"> rules</w:t>
+        <w:t>Color rules</w:t>
       </w:r>
     </w:p>
     <w:p>
@@ -3534,7 +3329,6 @@
         </w:numPr>
         <w:spacing w:after="70" w:line="260" w:lineRule="auto"/>
       </w:pPr>
-      <w:proofErr w:type="gramStart"/>
       <w:r>
         <w:rPr>
           <w:b/>
@@ -3554,24 +3348,11 @@
           <w:b/>
           <w:bCs/>
         </w:rPr>
-        <w:t xml:space="preserve"> code,</w:t>
-      </w:r>
-      <w:proofErr w:type="gramEnd"/>
-      <w:r>
-        <w:rPr>
-          <w:b/>
-          <w:bCs/>
-        </w:rPr>
-        <w:t xml:space="preserve"> used everywhere.</w:t>
+        <w:t xml:space="preserve"> code, used everywhere.</w:t>
       </w:r>
       <w:r>
-        <w:t xml:space="preserve"> Hell’s Kitchen is red, Astoria amber and Lower Manhattan teal on the map, the ranking list and </w:t>
+        <w:t xml:space="preserve"> Hell’s Kitchen is red, Astoria amber and Lower Manhattan teal on the map, the ranking list and the Chart</w:t>
       </w:r>
-      <w:proofErr w:type="gramStart"/>
-      <w:r>
-        <w:t>the Chart</w:t>
-      </w:r>
-      <w:proofErr w:type="gramEnd"/>
       <w:r>
         <w:t xml:space="preserve"> 3 legend and points, so the code is learned once (REQ-C2-03, REQ-C2-09, REQ-C3-03, REQ-ETH-03; Rationale §5, §7). The heat map does not split by store, so it uses only the ramp.</w:t>
       </w:r>
@@ -3616,25 +3397,10 @@
           <w:b/>
           <w:bCs/>
         </w:rPr>
-        <w:t>Color</w:t>
+        <w:t>Color never carries a finding alone.</w:t>
       </w:r>
       <w:r>
-        <w:rPr>
-          <w:b/>
-          <w:bCs/>
-        </w:rPr>
-        <w:t xml:space="preserve"> never carries a finding alone.</w:t>
-      </w:r>
-      <w:r>
-        <w:t xml:space="preserve"> Exact counts are printed in every heat map </w:t>
-      </w:r>
-      <w:proofErr w:type="gramStart"/>
-      <w:r>
-        <w:t>cell</w:t>
-      </w:r>
-      <w:proofErr w:type="gramEnd"/>
-      <w:r>
-        <w:t xml:space="preserve"> and the ranking list repeats the map’s values (REQ-C1-03, REQ-C2-04).</w:t>
+        <w:t xml:space="preserve"> Exact counts are printed in every heat map cell and the ranking list repeats the map’s values (REQ-C1-03, REQ-C2-04).</w:t>
       </w:r>
     </w:p>
     <w:p>
@@ -3705,12 +3471,6 @@
         <w:gridCol w:w="4320"/>
       </w:tblGrid>
       <w:tr>
-        <w:tblPrEx>
-          <w:tblCellMar>
-            <w:top w:w="0" w:type="dxa"/>
-            <w:bottom w:w="0" w:type="dxa"/>
-          </w:tblCellMar>
-        </w:tblPrEx>
         <w:trPr>
           <w:cantSplit/>
           <w:tblHeader/>
@@ -3819,12 +3579,6 @@
         </w:tc>
       </w:tr>
       <w:tr>
-        <w:tblPrEx>
-          <w:tblCellMar>
-            <w:top w:w="0" w:type="dxa"/>
-            <w:bottom w:w="0" w:type="dxa"/>
-          </w:tblCellMar>
-        </w:tblPrEx>
         <w:trPr>
           <w:cantSplit/>
         </w:trPr>
@@ -3923,12 +3677,6 @@
         </w:tc>
       </w:tr>
       <w:tr>
-        <w:tblPrEx>
-          <w:tblCellMar>
-            <w:top w:w="0" w:type="dxa"/>
-            <w:bottom w:w="0" w:type="dxa"/>
-          </w:tblCellMar>
-        </w:tblPrEx>
         <w:trPr>
           <w:cantSplit/>
         </w:trPr>
@@ -4027,12 +3775,6 @@
         </w:tc>
       </w:tr>
       <w:tr>
-        <w:tblPrEx>
-          <w:tblCellMar>
-            <w:top w:w="0" w:type="dxa"/>
-            <w:bottom w:w="0" w:type="dxa"/>
-          </w:tblCellMar>
-        </w:tblPrEx>
         <w:trPr>
           <w:cantSplit/>
         </w:trPr>
@@ -4131,12 +3873,6 @@
         </w:tc>
       </w:tr>
       <w:tr>
-        <w:tblPrEx>
-          <w:tblCellMar>
-            <w:top w:w="0" w:type="dxa"/>
-            <w:bottom w:w="0" w:type="dxa"/>
-          </w:tblCellMar>
-        </w:tblPrEx>
         <w:trPr>
           <w:cantSplit/>
         </w:trPr>
@@ -4355,15 +4091,7 @@
         <w:spacing w:after="120" w:line="264" w:lineRule="auto"/>
       </w:pPr>
       <w:r>
-        <w:t xml:space="preserve">The page is a single reading column that follows the order of the questions: topline first, then when, where and how much. The shared filter bar and KPI band sit above all three </w:t>
-      </w:r>
-      <w:proofErr w:type="gramStart"/>
-      <w:r>
-        <w:t>charts</w:t>
-      </w:r>
-      <w:proofErr w:type="gramEnd"/>
-      <w:r>
-        <w:t xml:space="preserve"> so they govern everything below (REQ-FIL-01, REQ-KPI-01).</w:t>
+        <w:t>The page is a single reading column that follows the order of the questions: topline first, then when, where and how much. The shared filter bar and KPI band sit above all three charts so they govern everything below (REQ-FIL-01, REQ-KPI-01).</w:t>
       </w:r>
     </w:p>
     <w:p>
@@ -4457,12 +4185,6 @@
         <w:gridCol w:w="2700"/>
       </w:tblGrid>
       <w:tr>
-        <w:tblPrEx>
-          <w:tblCellMar>
-            <w:top w:w="0" w:type="dxa"/>
-            <w:bottom w:w="0" w:type="dxa"/>
-          </w:tblCellMar>
-        </w:tblPrEx>
         <w:trPr>
           <w:cantSplit/>
           <w:tblHeader/>
@@ -4605,12 +4327,6 @@
         </w:tc>
       </w:tr>
       <w:tr>
-        <w:tblPrEx>
-          <w:tblCellMar>
-            <w:top w:w="0" w:type="dxa"/>
-            <w:bottom w:w="0" w:type="dxa"/>
-          </w:tblCellMar>
-        </w:tblPrEx>
         <w:trPr>
           <w:cantSplit/>
         </w:trPr>
@@ -4739,12 +4455,6 @@
         </w:tc>
       </w:tr>
       <w:tr>
-        <w:tblPrEx>
-          <w:tblCellMar>
-            <w:top w:w="0" w:type="dxa"/>
-            <w:bottom w:w="0" w:type="dxa"/>
-          </w:tblCellMar>
-        </w:tblPrEx>
         <w:trPr>
           <w:cantSplit/>
         </w:trPr>
@@ -4873,12 +4583,6 @@
         </w:tc>
       </w:tr>
       <w:tr>
-        <w:tblPrEx>
-          <w:tblCellMar>
-            <w:top w:w="0" w:type="dxa"/>
-            <w:bottom w:w="0" w:type="dxa"/>
-          </w:tblCellMar>
-        </w:tblPrEx>
         <w:trPr>
           <w:cantSplit/>
         </w:trPr>
@@ -5007,12 +4711,6 @@
         </w:tc>
       </w:tr>
       <w:tr>
-        <w:tblPrEx>
-          <w:tblCellMar>
-            <w:top w:w="0" w:type="dxa"/>
-            <w:bottom w:w="0" w:type="dxa"/>
-          </w:tblCellMar>
-        </w:tblPrEx>
         <w:trPr>
           <w:cantSplit/>
         </w:trPr>
@@ -5155,12 +4853,6 @@
         </w:tc>
       </w:tr>
       <w:tr>
-        <w:tblPrEx>
-          <w:tblCellMar>
-            <w:top w:w="0" w:type="dxa"/>
-            <w:bottom w:w="0" w:type="dxa"/>
-          </w:tblCellMar>
-        </w:tblPrEx>
         <w:trPr>
           <w:cantSplit/>
         </w:trPr>
@@ -5289,12 +4981,6 @@
         </w:tc>
       </w:tr>
       <w:tr>
-        <w:tblPrEx>
-          <w:tblCellMar>
-            <w:top w:w="0" w:type="dxa"/>
-            <w:bottom w:w="0" w:type="dxa"/>
-          </w:tblCellMar>
-        </w:tblPrEx>
         <w:trPr>
           <w:cantSplit/>
         </w:trPr>
@@ -5423,12 +5109,6 @@
         </w:tc>
       </w:tr>
       <w:tr>
-        <w:tblPrEx>
-          <w:tblCellMar>
-            <w:top w:w="0" w:type="dxa"/>
-            <w:bottom w:w="0" w:type="dxa"/>
-          </w:tblCellMar>
-        </w:tblPrEx>
         <w:trPr>
           <w:cantSplit/>
         </w:trPr>
@@ -5557,12 +5237,6 @@
         </w:tc>
       </w:tr>
       <w:tr>
-        <w:tblPrEx>
-          <w:tblCellMar>
-            <w:top w:w="0" w:type="dxa"/>
-            <w:bottom w:w="0" w:type="dxa"/>
-          </w:tblCellMar>
-        </w:tblPrEx>
         <w:trPr>
           <w:cantSplit/>
         </w:trPr>
@@ -5738,15 +5412,7 @@
         <w:spacing w:after="70" w:line="260" w:lineRule="auto"/>
       </w:pPr>
       <w:r>
-        <w:t xml:space="preserve">Supporting panels (ranking list, regression statistics) sit beside the chart on wide screens and </w:t>
-      </w:r>
-      <w:proofErr w:type="gramStart"/>
-      <w:r>
-        <w:t>wrap</w:t>
-      </w:r>
-      <w:proofErr w:type="gramEnd"/>
-      <w:r>
-        <w:t xml:space="preserve"> beneath it on narrow ones (REQ-RES-03).</w:t>
+        <w:t>Supporting panels (ranking list, regression statistics) sit beside the chart on wide screens and wrap beneath it on narrow ones (REQ-RES-03).</w:t>
       </w:r>
     </w:p>
     <w:p>
@@ -5891,12 +5557,6 @@
         <w:gridCol w:w="5420"/>
       </w:tblGrid>
       <w:tr>
-        <w:tblPrEx>
-          <w:tblCellMar>
-            <w:top w:w="0" w:type="dxa"/>
-            <w:bottom w:w="0" w:type="dxa"/>
-          </w:tblCellMar>
-        </w:tblPrEx>
         <w:trPr>
           <w:cantSplit/>
           <w:tblHeader/>
@@ -6005,12 +5665,6 @@
         </w:tc>
       </w:tr>
       <w:tr>
-        <w:tblPrEx>
-          <w:tblCellMar>
-            <w:top w:w="0" w:type="dxa"/>
-            <w:bottom w:w="0" w:type="dxa"/>
-          </w:tblCellMar>
-        </w:tblPrEx>
         <w:trPr>
           <w:cantSplit/>
         </w:trPr>
@@ -6103,17 +5757,8 @@
                 <w:sz w:val="18"/>
                 <w:szCs w:val="18"/>
               </w:rPr>
-              <w:t xml:space="preserve">Filters </w:t>
-            </w:r>
-            <w:proofErr w:type="gramStart"/>
-            <w:r>
-              <w:rPr>
-                <w:sz w:val="18"/>
-                <w:szCs w:val="18"/>
-              </w:rPr>
-              <w:t>all</w:t>
-            </w:r>
-            <w:proofErr w:type="gramEnd"/>
+              <w:t>Filters all</w:t>
+            </w:r>
             <w:r>
               <w:rPr>
                 <w:sz w:val="18"/>
@@ -6125,12 +5770,6 @@
         </w:tc>
       </w:tr>
       <w:tr>
-        <w:tblPrEx>
-          <w:tblCellMar>
-            <w:top w:w="0" w:type="dxa"/>
-            <w:bottom w:w="0" w:type="dxa"/>
-          </w:tblCellMar>
-        </w:tblPrEx>
         <w:trPr>
           <w:cantSplit/>
         </w:trPr>
@@ -6223,34 +5862,12 @@
                 <w:sz w:val="18"/>
                 <w:szCs w:val="18"/>
               </w:rPr>
-              <w:t xml:space="preserve">Filters </w:t>
-            </w:r>
-            <w:proofErr w:type="gramStart"/>
-            <w:r>
-              <w:rPr>
-                <w:sz w:val="18"/>
-                <w:szCs w:val="18"/>
-              </w:rPr>
-              <w:t>all</w:t>
-            </w:r>
-            <w:proofErr w:type="gramEnd"/>
-            <w:r>
-              <w:rPr>
-                <w:sz w:val="18"/>
-                <w:szCs w:val="18"/>
-              </w:rPr>
-              <w:t xml:space="preserve"> three charts and the KPI band. Category chips are keyboard reachable (REQ-ACC-01).</w:t>
+              <w:t>Filters all three charts and the KPI band. Category chips are keyboard reachable (REQ-ACC-01).</w:t>
             </w:r>
           </w:p>
         </w:tc>
       </w:tr>
       <w:tr>
-        <w:tblPrEx>
-          <w:tblCellMar>
-            <w:top w:w="0" w:type="dxa"/>
-            <w:bottom w:w="0" w:type="dxa"/>
-          </w:tblCellMar>
-        </w:tblPrEx>
         <w:trPr>
           <w:cantSplit/>
         </w:trPr>
@@ -6349,12 +5966,6 @@
         </w:tc>
       </w:tr>
       <w:tr>
-        <w:tblPrEx>
-          <w:tblCellMar>
-            <w:top w:w="0" w:type="dxa"/>
-            <w:bottom w:w="0" w:type="dxa"/>
-          </w:tblCellMar>
-        </w:tblPrEx>
         <w:trPr>
           <w:cantSplit/>
         </w:trPr>
@@ -6453,12 +6064,6 @@
         </w:tc>
       </w:tr>
       <w:tr>
-        <w:tblPrEx>
-          <w:tblCellMar>
-            <w:top w:w="0" w:type="dxa"/>
-            <w:bottom w:w="0" w:type="dxa"/>
-          </w:tblCellMar>
-        </w:tblPrEx>
         <w:trPr>
           <w:cantSplit/>
         </w:trPr>
@@ -6521,23 +6126,7 @@
                 <w:sz w:val="18"/>
                 <w:szCs w:val="18"/>
               </w:rPr>
-              <w:t xml:space="preserve">Text links: When, Where, </w:t>
-            </w:r>
-            <w:proofErr w:type="gramStart"/>
-            <w:r>
-              <w:rPr>
-                <w:sz w:val="18"/>
-                <w:szCs w:val="18"/>
-              </w:rPr>
-              <w:t>How</w:t>
-            </w:r>
-            <w:proofErr w:type="gramEnd"/>
-            <w:r>
-              <w:rPr>
-                <w:sz w:val="18"/>
-                <w:szCs w:val="18"/>
-              </w:rPr>
-              <w:t xml:space="preserve"> much</w:t>
+              <w:t>Text links: When, Where, How much</w:t>
             </w:r>
           </w:p>
         </w:tc>
@@ -6624,12 +6213,6 @@
         <w:gridCol w:w="2720"/>
       </w:tblGrid>
       <w:tr>
-        <w:tblPrEx>
-          <w:tblCellMar>
-            <w:top w:w="0" w:type="dxa"/>
-            <w:bottom w:w="0" w:type="dxa"/>
-          </w:tblCellMar>
-        </w:tblPrEx>
         <w:trPr>
           <w:cantSplit/>
           <w:tblHeader/>
@@ -6772,12 +6355,6 @@
         </w:tc>
       </w:tr>
       <w:tr>
-        <w:tblPrEx>
-          <w:tblCellMar>
-            <w:top w:w="0" w:type="dxa"/>
-            <w:bottom w:w="0" w:type="dxa"/>
-          </w:tblCellMar>
-        </w:tblPrEx>
         <w:trPr>
           <w:cantSplit/>
         </w:trPr>
@@ -6906,12 +6483,6 @@
         </w:tc>
       </w:tr>
       <w:tr>
-        <w:tblPrEx>
-          <w:tblCellMar>
-            <w:top w:w="0" w:type="dxa"/>
-            <w:bottom w:w="0" w:type="dxa"/>
-          </w:tblCellMar>
-        </w:tblPrEx>
         <w:trPr>
           <w:cantSplit/>
         </w:trPr>
@@ -7040,12 +6611,6 @@
         </w:tc>
       </w:tr>
       <w:tr>
-        <w:tblPrEx>
-          <w:tblCellMar>
-            <w:top w:w="0" w:type="dxa"/>
-            <w:bottom w:w="0" w:type="dxa"/>
-          </w:tblCellMar>
-        </w:tblPrEx>
         <w:trPr>
           <w:cantSplit/>
         </w:trPr>
@@ -7174,12 +6739,6 @@
         </w:tc>
       </w:tr>
       <w:tr>
-        <w:tblPrEx>
-          <w:tblCellMar>
-            <w:top w:w="0" w:type="dxa"/>
-            <w:bottom w:w="0" w:type="dxa"/>
-          </w:tblCellMar>
-        </w:tblPrEx>
         <w:trPr>
           <w:cantSplit/>
         </w:trPr>
@@ -7308,12 +6867,6 @@
         </w:tc>
       </w:tr>
       <w:tr>
-        <w:tblPrEx>
-          <w:tblCellMar>
-            <w:top w:w="0" w:type="dxa"/>
-            <w:bottom w:w="0" w:type="dxa"/>
-          </w:tblCellMar>
-        </w:tblPrEx>
         <w:trPr>
           <w:cantSplit/>
         </w:trPr>
@@ -7492,12 +7045,6 @@
         <w:gridCol w:w="7620"/>
       </w:tblGrid>
       <w:tr>
-        <w:tblPrEx>
-          <w:tblCellMar>
-            <w:top w:w="0" w:type="dxa"/>
-            <w:bottom w:w="0" w:type="dxa"/>
-          </w:tblCellMar>
-        </w:tblPrEx>
         <w:trPr>
           <w:cantSplit/>
         </w:trPr>
@@ -7566,12 +7113,6 @@
         </w:tc>
       </w:tr>
       <w:tr>
-        <w:tblPrEx>
-          <w:tblCellMar>
-            <w:top w:w="0" w:type="dxa"/>
-            <w:bottom w:w="0" w:type="dxa"/>
-          </w:tblCellMar>
-        </w:tblPrEx>
         <w:trPr>
           <w:cantSplit/>
         </w:trPr>
@@ -7634,33 +7175,15 @@
                 <w:sz w:val="18"/>
                 <w:szCs w:val="18"/>
               </w:rPr>
-              <w:t xml:space="preserve">Transaction </w:t>
-            </w:r>
-            <w:proofErr w:type="gramStart"/>
-            <w:r>
-              <w:rPr>
-                <w:sz w:val="18"/>
-                <w:szCs w:val="18"/>
-              </w:rPr>
-              <w:t>count</w:t>
-            </w:r>
-            <w:proofErr w:type="gramEnd"/>
-            <w:r>
-              <w:rPr>
-                <w:sz w:val="18"/>
-                <w:szCs w:val="18"/>
-              </w:rPr>
-              <w:t xml:space="preserve"> as single-hue sequential </w:t>
-            </w:r>
-            <w:proofErr w:type="spellStart"/>
-            <w:r>
-              <w:rPr>
-                <w:sz w:val="18"/>
-                <w:szCs w:val="18"/>
-              </w:rPr>
-              <w:t>colour</w:t>
-            </w:r>
-            <w:proofErr w:type="spellEnd"/>
+              <w:t xml:space="preserve">Transaction count as single-hue sequential </w:t>
+            </w:r>
+            <w:r>
+              <w:rPr>
+                <w:sz w:val="18"/>
+                <w:szCs w:val="18"/>
+              </w:rPr>
+              <w:t>color</w:t>
+            </w:r>
             <w:r>
               <w:rPr>
                 <w:sz w:val="18"/>
@@ -7672,12 +7195,6 @@
         </w:tc>
       </w:tr>
       <w:tr>
-        <w:tblPrEx>
-          <w:tblCellMar>
-            <w:top w:w="0" w:type="dxa"/>
-            <w:bottom w:w="0" w:type="dxa"/>
-          </w:tblCellMar>
-        </w:tblPrEx>
         <w:trPr>
           <w:cantSplit/>
         </w:trPr>
@@ -7760,12 +7277,6 @@
         </w:tc>
       </w:tr>
       <w:tr>
-        <w:tblPrEx>
-          <w:tblCellMar>
-            <w:top w:w="0" w:type="dxa"/>
-            <w:bottom w:w="0" w:type="dxa"/>
-          </w:tblCellMar>
-        </w:tblPrEx>
         <w:trPr>
           <w:cantSplit/>
         </w:trPr>
@@ -7834,12 +7345,6 @@
         </w:tc>
       </w:tr>
       <w:tr>
-        <w:tblPrEx>
-          <w:tblCellMar>
-            <w:top w:w="0" w:type="dxa"/>
-            <w:bottom w:w="0" w:type="dxa"/>
-          </w:tblCellMar>
-        </w:tblPrEx>
         <w:trPr>
           <w:cantSplit/>
         </w:trPr>
@@ -7908,12 +7413,6 @@
         </w:tc>
       </w:tr>
       <w:tr>
-        <w:tblPrEx>
-          <w:tblCellMar>
-            <w:top w:w="0" w:type="dxa"/>
-            <w:bottom w:w="0" w:type="dxa"/>
-          </w:tblCellMar>
-        </w:tblPrEx>
         <w:trPr>
           <w:cantSplit/>
         </w:trPr>
@@ -8089,12 +7588,6 @@
         <w:gridCol w:w="7620"/>
       </w:tblGrid>
       <w:tr>
-        <w:tblPrEx>
-          <w:tblCellMar>
-            <w:top w:w="0" w:type="dxa"/>
-            <w:bottom w:w="0" w:type="dxa"/>
-          </w:tblCellMar>
-        </w:tblPrEx>
         <w:trPr>
           <w:cantSplit/>
         </w:trPr>
@@ -8163,12 +7656,6 @@
         </w:tc>
       </w:tr>
       <w:tr>
-        <w:tblPrEx>
-          <w:tblCellMar>
-            <w:top w:w="0" w:type="dxa"/>
-            <w:bottom w:w="0" w:type="dxa"/>
-          </w:tblCellMar>
-        </w:tblPrEx>
         <w:trPr>
           <w:cantSplit/>
         </w:trPr>
@@ -8267,12 +7754,6 @@
         </w:tc>
       </w:tr>
       <w:tr>
-        <w:tblPrEx>
-          <w:tblCellMar>
-            <w:top w:w="0" w:type="dxa"/>
-            <w:bottom w:w="0" w:type="dxa"/>
-          </w:tblCellMar>
-        </w:tblPrEx>
         <w:trPr>
           <w:cantSplit/>
         </w:trPr>
@@ -8335,34 +7816,12 @@
                 <w:sz w:val="18"/>
                 <w:szCs w:val="18"/>
               </w:rPr>
-              <w:t xml:space="preserve">Dark map </w:t>
-            </w:r>
-            <w:proofErr w:type="gramStart"/>
-            <w:r>
-              <w:rPr>
-                <w:sz w:val="18"/>
-                <w:szCs w:val="18"/>
-              </w:rPr>
-              <w:t>panel (#</w:t>
-            </w:r>
-            <w:proofErr w:type="gramEnd"/>
-            <w:r>
-              <w:rPr>
-                <w:sz w:val="18"/>
-                <w:szCs w:val="18"/>
-              </w:rPr>
-              <w:t>241D18) with river and district labels in a muted tone, north arrow and a 2 km scale bar; disclosed in the footer as simplified geometry (REQ-DATA-03)</w:t>
+              <w:t>Dark map panel (#241D18) with river and district labels in a muted tone, north arrow and a 2 km scale bar; disclosed in the footer as simplified geometry (REQ-DATA-03)</w:t>
             </w:r>
           </w:p>
         </w:tc>
       </w:tr>
       <w:tr>
-        <w:tblPrEx>
-          <w:tblCellMar>
-            <w:top w:w="0" w:type="dxa"/>
-            <w:bottom w:w="0" w:type="dxa"/>
-          </w:tblCellMar>
-        </w:tblPrEx>
         <w:trPr>
           <w:cantSplit/>
         </w:trPr>
@@ -8445,12 +7904,6 @@
         </w:tc>
       </w:tr>
       <w:tr>
-        <w:tblPrEx>
-          <w:tblCellMar>
-            <w:top w:w="0" w:type="dxa"/>
-            <w:bottom w:w="0" w:type="dxa"/>
-          </w:tblCellMar>
-        </w:tblPrEx>
         <w:trPr>
           <w:cantSplit/>
         </w:trPr>
@@ -8519,12 +7972,6 @@
         </w:tc>
       </w:tr>
       <w:tr>
-        <w:tblPrEx>
-          <w:tblCellMar>
-            <w:top w:w="0" w:type="dxa"/>
-            <w:bottom w:w="0" w:type="dxa"/>
-          </w:tblCellMar>
-        </w:tblPrEx>
         <w:trPr>
           <w:cantSplit/>
         </w:trPr>
@@ -8593,12 +8040,6 @@
         </w:tc>
       </w:tr>
       <w:tr>
-        <w:tblPrEx>
-          <w:tblCellMar>
-            <w:top w:w="0" w:type="dxa"/>
-            <w:bottom w:w="0" w:type="dxa"/>
-          </w:tblCellMar>
-        </w:tblPrEx>
         <w:trPr>
           <w:cantSplit/>
         </w:trPr>
@@ -8775,12 +8216,6 @@
         <w:gridCol w:w="7620"/>
       </w:tblGrid>
       <w:tr>
-        <w:tblPrEx>
-          <w:tblCellMar>
-            <w:top w:w="0" w:type="dxa"/>
-            <w:bottom w:w="0" w:type="dxa"/>
-          </w:tblCellMar>
-        </w:tblPrEx>
         <w:trPr>
           <w:cantSplit/>
         </w:trPr>
@@ -8849,12 +8284,6 @@
         </w:tc>
       </w:tr>
       <w:tr>
-        <w:tblPrEx>
-          <w:tblCellMar>
-            <w:top w:w="0" w:type="dxa"/>
-            <w:bottom w:w="0" w:type="dxa"/>
-          </w:tblCellMar>
-        </w:tblPrEx>
         <w:trPr>
           <w:cantSplit/>
         </w:trPr>
@@ -8937,12 +8366,6 @@
         </w:tc>
       </w:tr>
       <w:tr>
-        <w:tblPrEx>
-          <w:tblCellMar>
-            <w:top w:w="0" w:type="dxa"/>
-            <w:bottom w:w="0" w:type="dxa"/>
-          </w:tblCellMar>
-        </w:tblPrEx>
         <w:trPr>
           <w:cantSplit/>
         </w:trPr>
@@ -9011,12 +8434,6 @@
         </w:tc>
       </w:tr>
       <w:tr>
-        <w:tblPrEx>
-          <w:tblCellMar>
-            <w:top w:w="0" w:type="dxa"/>
-            <w:bottom w:w="0" w:type="dxa"/>
-          </w:tblCellMar>
-        </w:tblPrEx>
         <w:trPr>
           <w:cantSplit/>
         </w:trPr>
@@ -9092,12 +8509,6 @@
         </w:tc>
       </w:tr>
       <w:tr>
-        <w:tblPrEx>
-          <w:tblCellMar>
-            <w:top w:w="0" w:type="dxa"/>
-            <w:bottom w:w="0" w:type="dxa"/>
-          </w:tblCellMar>
-        </w:tblPrEx>
         <w:trPr>
           <w:cantSplit/>
         </w:trPr>
@@ -9166,12 +8577,6 @@
         </w:tc>
       </w:tr>
       <w:tr>
-        <w:tblPrEx>
-          <w:tblCellMar>
-            <w:top w:w="0" w:type="dxa"/>
-            <w:bottom w:w="0" w:type="dxa"/>
-          </w:tblCellMar>
-        </w:tblPrEx>
         <w:trPr>
           <w:cantSplit/>
         </w:trPr>
@@ -9465,12 +8870,6 @@
         <w:gridCol w:w="1920"/>
       </w:tblGrid>
       <w:tr>
-        <w:tblPrEx>
-          <w:tblCellMar>
-            <w:top w:w="0" w:type="dxa"/>
-            <w:bottom w:w="0" w:type="dxa"/>
-          </w:tblCellMar>
-        </w:tblPrEx>
         <w:trPr>
           <w:cantSplit/>
           <w:tblHeader/>
@@ -9647,12 +9046,6 @@
         </w:tc>
       </w:tr>
       <w:tr>
-        <w:tblPrEx>
-          <w:tblCellMar>
-            <w:top w:w="0" w:type="dxa"/>
-            <w:bottom w:w="0" w:type="dxa"/>
-          </w:tblCellMar>
-        </w:tblPrEx>
         <w:trPr>
           <w:cantSplit/>
         </w:trPr>
@@ -9811,12 +9204,6 @@
         </w:tc>
       </w:tr>
       <w:tr>
-        <w:tblPrEx>
-          <w:tblCellMar>
-            <w:top w:w="0" w:type="dxa"/>
-            <w:bottom w:w="0" w:type="dxa"/>
-          </w:tblCellMar>
-        </w:tblPrEx>
         <w:trPr>
           <w:cantSplit/>
         </w:trPr>
@@ -9975,12 +9362,6 @@
         </w:tc>
       </w:tr>
       <w:tr>
-        <w:tblPrEx>
-          <w:tblCellMar>
-            <w:top w:w="0" w:type="dxa"/>
-            <w:bottom w:w="0" w:type="dxa"/>
-          </w:tblCellMar>
-        </w:tblPrEx>
         <w:trPr>
           <w:cantSplit/>
         </w:trPr>
@@ -10139,12 +9520,6 @@
         </w:tc>
       </w:tr>
       <w:tr>
-        <w:tblPrEx>
-          <w:tblCellMar>
-            <w:top w:w="0" w:type="dxa"/>
-            <w:bottom w:w="0" w:type="dxa"/>
-          </w:tblCellMar>
-        </w:tblPrEx>
         <w:trPr>
           <w:cantSplit/>
         </w:trPr>
@@ -10262,21 +9637,12 @@
             <w:pPr>
               <w:spacing w:after="30"/>
             </w:pPr>
-            <w:proofErr w:type="gramStart"/>
-            <w:r>
-              <w:rPr>
-                <w:sz w:val="18"/>
-                <w:szCs w:val="18"/>
-              </w:rPr>
-              <w:t>Click</w:t>
-            </w:r>
-            <w:proofErr w:type="gramEnd"/>
-            <w:r>
-              <w:rPr>
-                <w:sz w:val="18"/>
-                <w:szCs w:val="18"/>
-              </w:rPr>
-              <w:t xml:space="preserve"> the same store again</w:t>
+            <w:r>
+              <w:rPr>
+                <w:sz w:val="18"/>
+                <w:szCs w:val="18"/>
+              </w:rPr>
+              <w:t>Click the same store again</w:t>
             </w:r>
           </w:p>
         </w:tc>
@@ -10312,12 +9678,6 @@
         </w:tc>
       </w:tr>
       <w:tr>
-        <w:tblPrEx>
-          <w:tblCellMar>
-            <w:top w:w="0" w:type="dxa"/>
-            <w:bottom w:w="0" w:type="dxa"/>
-          </w:tblCellMar>
-        </w:tblPrEx>
         <w:trPr>
           <w:cantSplit/>
         </w:trPr>
@@ -10476,12 +9836,6 @@
         </w:tc>
       </w:tr>
       <w:tr>
-        <w:tblPrEx>
-          <w:tblCellMar>
-            <w:top w:w="0" w:type="dxa"/>
-            <w:bottom w:w="0" w:type="dxa"/>
-          </w:tblCellMar>
-        </w:tblPrEx>
         <w:trPr>
           <w:cantSplit/>
         </w:trPr>
@@ -10574,17 +9928,8 @@
                 <w:sz w:val="18"/>
                 <w:szCs w:val="18"/>
               </w:rPr>
-              <w:t xml:space="preserve">Recomputes all charts and KPIs, no page </w:t>
-            </w:r>
-            <w:proofErr w:type="gramStart"/>
-            <w:r>
-              <w:rPr>
-                <w:sz w:val="18"/>
-                <w:szCs w:val="18"/>
-              </w:rPr>
-              <w:t>reload</w:t>
-            </w:r>
-            <w:proofErr w:type="gramEnd"/>
+              <w:t>Recomputes all charts and KPIs, no page reload</w:t>
+            </w:r>
           </w:p>
         </w:tc>
         <w:tc>
@@ -10649,12 +9994,6 @@
         </w:tc>
       </w:tr>
       <w:tr>
-        <w:tblPrEx>
-          <w:tblCellMar>
-            <w:top w:w="0" w:type="dxa"/>
-            <w:bottom w:w="0" w:type="dxa"/>
-          </w:tblCellMar>
-        </w:tblPrEx>
         <w:trPr>
           <w:cantSplit/>
         </w:trPr>
@@ -10814,12 +10153,6 @@
         </w:tc>
       </w:tr>
       <w:tr>
-        <w:tblPrEx>
-          <w:tblCellMar>
-            <w:top w:w="0" w:type="dxa"/>
-            <w:bottom w:w="0" w:type="dxa"/>
-          </w:tblCellMar>
-        </w:tblPrEx>
         <w:trPr>
           <w:cantSplit/>
         </w:trPr>
@@ -10912,17 +10245,8 @@
                 <w:sz w:val="18"/>
                 <w:szCs w:val="18"/>
               </w:rPr>
-              <w:t xml:space="preserve">Scrolls to </w:t>
-            </w:r>
-            <w:proofErr w:type="gramStart"/>
-            <w:r>
-              <w:rPr>
-                <w:sz w:val="18"/>
-                <w:szCs w:val="18"/>
-              </w:rPr>
-              <w:t>the When</w:t>
-            </w:r>
-            <w:proofErr w:type="gramEnd"/>
+              <w:t>Scrolls to the When</w:t>
+            </w:r>
             <w:r>
               <w:rPr>
                 <w:sz w:val="18"/>
@@ -10994,12 +10318,6 @@
         </w:tc>
       </w:tr>
       <w:tr>
-        <w:tblPrEx>
-          <w:tblCellMar>
-            <w:top w:w="0" w:type="dxa"/>
-            <w:bottom w:w="0" w:type="dxa"/>
-          </w:tblCellMar>
-        </w:tblPrEx>
         <w:trPr>
           <w:cantSplit/>
         </w:trPr>
@@ -11092,23 +10410,7 @@
                 <w:sz w:val="18"/>
                 <w:szCs w:val="18"/>
               </w:rPr>
-              <w:t xml:space="preserve">Switches light and dark </w:t>
-            </w:r>
-            <w:proofErr w:type="gramStart"/>
-            <w:r>
-              <w:rPr>
-                <w:sz w:val="18"/>
-                <w:szCs w:val="18"/>
-              </w:rPr>
-              <w:t>theme</w:t>
-            </w:r>
-            <w:proofErr w:type="gramEnd"/>
-            <w:r>
-              <w:rPr>
-                <w:sz w:val="18"/>
-                <w:szCs w:val="18"/>
-              </w:rPr>
-              <w:t>; choice remembered</w:t>
+              <w:t>Switches light and dark theme; choice remembered</w:t>
             </w:r>
           </w:p>
         </w:tc>
@@ -11216,11 +10518,9 @@
       <w:r>
         <w:t xml:space="preserve"> Hover and tooltip style, transition timing and highlight </w:t>
       </w:r>
-      <w:proofErr w:type="spellStart"/>
       <w:r>
-        <w:t>colour</w:t>
+        <w:t>color</w:t>
       </w:r>
-      <w:proofErr w:type="spellEnd"/>
       <w:r>
         <w:t xml:space="preserve"> are identical across all three charts, so the dashboard reads as one instrument rather than three separate charts (Minutes §6, Interaction consistency; Rationale §3).</w:t>
       </w:r>
@@ -11242,15 +10542,7 @@
         <w:t>Tooltips give exact values.</w:t>
       </w:r>
       <w:r>
-        <w:t xml:space="preserve"> Chart 1: day/hour count. Chart 2: store revenue and transaction </w:t>
-      </w:r>
-      <w:proofErr w:type="gramStart"/>
-      <w:r>
-        <w:t>detail</w:t>
-      </w:r>
-      <w:proofErr w:type="gramEnd"/>
-      <w:r>
-        <w:t>. Chart 3: daily units and revenue (Minutes §7, Day 4 tasks).</w:t>
+        <w:t xml:space="preserve"> Chart 1: day/hour count. Chart 2: store revenue and transaction detail. Chart 3: daily units and revenue (Minutes §7, Day 4 tasks).</w:t>
       </w:r>
     </w:p>
     <w:p>
@@ -11347,12 +10639,6 @@
         <w:gridCol w:w="3710"/>
       </w:tblGrid>
       <w:tr>
-        <w:tblPrEx>
-          <w:tblCellMar>
-            <w:top w:w="0" w:type="dxa"/>
-            <w:bottom w:w="0" w:type="dxa"/>
-          </w:tblCellMar>
-        </w:tblPrEx>
         <w:trPr>
           <w:cantSplit/>
           <w:tblHeader/>
@@ -11461,12 +10747,6 @@
         </w:tc>
       </w:tr>
       <w:tr>
-        <w:tblPrEx>
-          <w:tblCellMar>
-            <w:top w:w="0" w:type="dxa"/>
-            <w:bottom w:w="0" w:type="dxa"/>
-          </w:tblCellMar>
-        </w:tblPrEx>
         <w:trPr>
           <w:cantSplit/>
         </w:trPr>
@@ -11565,12 +10845,6 @@
         </w:tc>
       </w:tr>
       <w:tr>
-        <w:tblPrEx>
-          <w:tblCellMar>
-            <w:top w:w="0" w:type="dxa"/>
-            <w:bottom w:w="0" w:type="dxa"/>
-          </w:tblCellMar>
-        </w:tblPrEx>
         <w:trPr>
           <w:cantSplit/>
         </w:trPr>
@@ -11669,12 +10943,6 @@
         </w:tc>
       </w:tr>
       <w:tr>
-        <w:tblPrEx>
-          <w:tblCellMar>
-            <w:top w:w="0" w:type="dxa"/>
-            <w:bottom w:w="0" w:type="dxa"/>
-          </w:tblCellMar>
-        </w:tblPrEx>
         <w:trPr>
           <w:cantSplit/>
         </w:trPr>
@@ -11773,12 +11041,6 @@
         </w:tc>
       </w:tr>
       <w:tr>
-        <w:tblPrEx>
-          <w:tblCellMar>
-            <w:top w:w="0" w:type="dxa"/>
-            <w:bottom w:w="0" w:type="dxa"/>
-          </w:tblCellMar>
-        </w:tblPrEx>
         <w:trPr>
           <w:cantSplit/>
         </w:trPr>
@@ -11873,15 +11135,13 @@
               </w:rPr>
               <w:t xml:space="preserve">Same </w:t>
             </w:r>
-            <w:proofErr w:type="spellStart"/>
-            <w:r>
-              <w:rPr>
-                <w:sz w:val="18"/>
-                <w:szCs w:val="18"/>
-              </w:rPr>
-              <w:t>colours</w:t>
-            </w:r>
-            <w:proofErr w:type="spellEnd"/>
+            <w:r>
+              <w:rPr>
+                <w:sz w:val="18"/>
+                <w:szCs w:val="18"/>
+              </w:rPr>
+              <w:t>colors</w:t>
+            </w:r>
             <w:r>
               <w:rPr>
                 <w:sz w:val="18"/>
@@ -11893,12 +11153,6 @@
         </w:tc>
       </w:tr>
       <w:tr>
-        <w:tblPrEx>
-          <w:tblCellMar>
-            <w:top w:w="0" w:type="dxa"/>
-            <w:bottom w:w="0" w:type="dxa"/>
-          </w:tblCellMar>
-        </w:tblPrEx>
         <w:trPr>
           <w:cantSplit/>
         </w:trPr>
@@ -12039,15 +11293,7 @@
         <w:t>Control:</w:t>
       </w:r>
       <w:r>
-        <w:t xml:space="preserve"> a fixed toggle in the corner of the screen </w:t>
-      </w:r>
-      <w:proofErr w:type="gramStart"/>
-      <w:r>
-        <w:t>switches</w:t>
-      </w:r>
-      <w:proofErr w:type="gramEnd"/>
-      <w:r>
-        <w:t xml:space="preserve"> theme (REQ-THM-02); a manual override is remembered for the next visit (REQ-THM-04).</w:t>
+        <w:t xml:space="preserve"> a fixed toggle in the corner of the screen switches theme (REQ-THM-02); a manual override is remembered for the next visit (REQ-THM-04).</w:t>
       </w:r>
     </w:p>
     <w:p>
@@ -12098,12 +11344,6 @@
         <w:gridCol w:w="4860"/>
       </w:tblGrid>
       <w:tr>
-        <w:tblPrEx>
-          <w:tblCellMar>
-            <w:top w:w="0" w:type="dxa"/>
-            <w:bottom w:w="0" w:type="dxa"/>
-          </w:tblCellMar>
-        </w:tblPrEx>
         <w:trPr>
           <w:cantSplit/>
         </w:trPr>
@@ -12124,6 +11364,9 @@
               <w:jc w:val="center"/>
             </w:pPr>
             <w:r>
+              <w:rPr>
+                <w:noProof/>
+              </w:rPr>
               <w:lastRenderedPageBreak/>
               <w:drawing>
                 <wp:inline distT="0" distB="0" distL="0" distR="0" wp14:anchorId="3BE58BD6" wp14:editId="20750F93">
@@ -12196,6 +11439,9 @@
               <w:jc w:val="center"/>
             </w:pPr>
             <w:r>
+              <w:rPr>
+                <w:noProof/>
+              </w:rPr>
               <w:drawing>
                 <wp:inline distT="0" distB="0" distL="0" distR="0" wp14:anchorId="13A7821A" wp14:editId="4B3D2CFC">
                   <wp:extent cx="2176040" cy="5138654"/>
@@ -12315,12 +11561,6 @@
         <w:gridCol w:w="1900"/>
       </w:tblGrid>
       <w:tr>
-        <w:tblPrEx>
-          <w:tblCellMar>
-            <w:top w:w="0" w:type="dxa"/>
-            <w:bottom w:w="0" w:type="dxa"/>
-          </w:tblCellMar>
-        </w:tblPrEx>
         <w:trPr>
           <w:cantSplit/>
           <w:tblHeader/>
@@ -12429,12 +11669,6 @@
         </w:tc>
       </w:tr>
       <w:tr>
-        <w:tblPrEx>
-          <w:tblCellMar>
-            <w:top w:w="0" w:type="dxa"/>
-            <w:bottom w:w="0" w:type="dxa"/>
-          </w:tblCellMar>
-        </w:tblPrEx>
         <w:trPr>
           <w:cantSplit/>
         </w:trPr>
@@ -12533,12 +11767,6 @@
         </w:tc>
       </w:tr>
       <w:tr>
-        <w:tblPrEx>
-          <w:tblCellMar>
-            <w:top w:w="0" w:type="dxa"/>
-            <w:bottom w:w="0" w:type="dxa"/>
-          </w:tblCellMar>
-        </w:tblPrEx>
         <w:trPr>
           <w:cantSplit/>
         </w:trPr>
@@ -12637,12 +11865,6 @@
         </w:tc>
       </w:tr>
       <w:tr>
-        <w:tblPrEx>
-          <w:tblCellMar>
-            <w:top w:w="0" w:type="dxa"/>
-            <w:bottom w:w="0" w:type="dxa"/>
-          </w:tblCellMar>
-        </w:tblPrEx>
         <w:trPr>
           <w:cantSplit/>
         </w:trPr>
@@ -12705,23 +11927,7 @@
                 <w:sz w:val="18"/>
                 <w:szCs w:val="18"/>
               </w:rPr>
-              <w:t xml:space="preserve">Non-essential animation and </w:t>
-            </w:r>
-            <w:proofErr w:type="gramStart"/>
-            <w:r>
-              <w:rPr>
-                <w:sz w:val="18"/>
-                <w:szCs w:val="18"/>
-              </w:rPr>
-              <w:t>smooth-scroll</w:t>
-            </w:r>
-            <w:proofErr w:type="gramEnd"/>
-            <w:r>
-              <w:rPr>
-                <w:sz w:val="18"/>
-                <w:szCs w:val="18"/>
-              </w:rPr>
-              <w:t xml:space="preserve"> are disabled when the operating system requests reduced motion</w:t>
+              <w:t>Non-essential animation and smooth-scroll are disabled when the operating system requests reduced motion</w:t>
             </w:r>
           </w:p>
         </w:tc>
@@ -12757,12 +11963,6 @@
         </w:tc>
       </w:tr>
       <w:tr>
-        <w:tblPrEx>
-          <w:tblCellMar>
-            <w:top w:w="0" w:type="dxa"/>
-            <w:bottom w:w="0" w:type="dxa"/>
-          </w:tblCellMar>
-        </w:tblPrEx>
         <w:trPr>
           <w:cantSplit/>
         </w:trPr>
@@ -12788,7 +11988,6 @@
             <w:pPr>
               <w:spacing w:after="30"/>
             </w:pPr>
-            <w:proofErr w:type="spellStart"/>
             <w:r>
               <w:rPr>
                 <w:b/>
@@ -12796,9 +11995,8 @@
                 <w:sz w:val="18"/>
                 <w:szCs w:val="18"/>
               </w:rPr>
-              <w:t>Colour</w:t>
-            </w:r>
-            <w:proofErr w:type="spellEnd"/>
+              <w:t>Color</w:t>
+            </w:r>
             <w:r>
               <w:rPr>
                 <w:b/>
@@ -12872,12 +12070,6 @@
         </w:tc>
       </w:tr>
       <w:tr>
-        <w:tblPrEx>
-          <w:tblCellMar>
-            <w:top w:w="0" w:type="dxa"/>
-            <w:bottom w:w="0" w:type="dxa"/>
-          </w:tblCellMar>
-        </w:tblPrEx>
         <w:trPr>
           <w:cantSplit/>
         </w:trPr>
@@ -12976,12 +12168,6 @@
         </w:tc>
       </w:tr>
       <w:tr>
-        <w:tblPrEx>
-          <w:tblCellMar>
-            <w:top w:w="0" w:type="dxa"/>
-            <w:bottom w:w="0" w:type="dxa"/>
-          </w:tblCellMar>
-        </w:tblPrEx>
         <w:trPr>
           <w:cantSplit/>
         </w:trPr>
@@ -13128,12 +12314,6 @@
         <w:gridCol w:w="2000"/>
       </w:tblGrid>
       <w:tr>
-        <w:tblPrEx>
-          <w:tblCellMar>
-            <w:top w:w="0" w:type="dxa"/>
-            <w:bottom w:w="0" w:type="dxa"/>
-          </w:tblCellMar>
-        </w:tblPrEx>
         <w:trPr>
           <w:cantSplit/>
           <w:tblHeader/>
@@ -13242,12 +12422,6 @@
         </w:tc>
       </w:tr>
       <w:tr>
-        <w:tblPrEx>
-          <w:tblCellMar>
-            <w:top w:w="0" w:type="dxa"/>
-            <w:bottom w:w="0" w:type="dxa"/>
-          </w:tblCellMar>
-        </w:tblPrEx>
         <w:trPr>
           <w:cantSplit/>
         </w:trPr>
@@ -13346,12 +12520,6 @@
         </w:tc>
       </w:tr>
       <w:tr>
-        <w:tblPrEx>
-          <w:tblCellMar>
-            <w:top w:w="0" w:type="dxa"/>
-            <w:bottom w:w="0" w:type="dxa"/>
-          </w:tblCellMar>
-        </w:tblPrEx>
         <w:trPr>
           <w:cantSplit/>
         </w:trPr>
@@ -13466,12 +12634,6 @@
         </w:tc>
       </w:tr>
       <w:tr>
-        <w:tblPrEx>
-          <w:tblCellMar>
-            <w:top w:w="0" w:type="dxa"/>
-            <w:bottom w:w="0" w:type="dxa"/>
-          </w:tblCellMar>
-        </w:tblPrEx>
         <w:trPr>
           <w:cantSplit/>
         </w:trPr>
@@ -13506,7 +12668,6 @@
               </w:rPr>
               <w:t xml:space="preserve">One </w:t>
             </w:r>
-            <w:proofErr w:type="spellStart"/>
             <w:r>
               <w:rPr>
                 <w:b/>
@@ -13514,9 +12675,8 @@
                 <w:sz w:val="18"/>
                 <w:szCs w:val="18"/>
               </w:rPr>
-              <w:t>colour</w:t>
-            </w:r>
-            <w:proofErr w:type="spellEnd"/>
+              <w:t>color</w:t>
+            </w:r>
             <w:r>
               <w:rPr>
                 <w:b/>
@@ -13604,12 +12764,6 @@
         </w:tc>
       </w:tr>
       <w:tr>
-        <w:tblPrEx>
-          <w:tblCellMar>
-            <w:top w:w="0" w:type="dxa"/>
-            <w:bottom w:w="0" w:type="dxa"/>
-          </w:tblCellMar>
-        </w:tblPrEx>
         <w:trPr>
           <w:cantSplit/>
         </w:trPr>
@@ -13708,12 +12862,6 @@
         </w:tc>
       </w:tr>
       <w:tr>
-        <w:tblPrEx>
-          <w:tblCellMar>
-            <w:top w:w="0" w:type="dxa"/>
-            <w:bottom w:w="0" w:type="dxa"/>
-          </w:tblCellMar>
-        </w:tblPrEx>
         <w:trPr>
           <w:cantSplit/>
         </w:trPr>
@@ -13868,12 +13016,6 @@
         <w:gridCol w:w="1320"/>
       </w:tblGrid>
       <w:tr>
-        <w:tblPrEx>
-          <w:tblCellMar>
-            <w:top w:w="0" w:type="dxa"/>
-            <w:bottom w:w="0" w:type="dxa"/>
-          </w:tblCellMar>
-        </w:tblPrEx>
         <w:trPr>
           <w:cantSplit/>
           <w:tblHeader/>
@@ -14050,12 +13192,6 @@
         </w:tc>
       </w:tr>
       <w:tr>
-        <w:tblPrEx>
-          <w:tblCellMar>
-            <w:top w:w="0" w:type="dxa"/>
-            <w:bottom w:w="0" w:type="dxa"/>
-          </w:tblCellMar>
-        </w:tblPrEx>
         <w:trPr>
           <w:cantSplit/>
         </w:trPr>
@@ -14088,25 +13224,7 @@
                 <w:sz w:val="18"/>
                 <w:szCs w:val="18"/>
               </w:rPr>
-              <w:t>Color</w:t>
-            </w:r>
-            <w:r>
-              <w:rPr>
-                <w:b/>
-                <w:bCs/>
-                <w:sz w:val="18"/>
-                <w:szCs w:val="18"/>
-              </w:rPr>
-              <w:t xml:space="preserve"> palette and store </w:t>
-            </w:r>
-            <w:r>
-              <w:rPr>
-                <w:b/>
-                <w:bCs/>
-                <w:sz w:val="18"/>
-                <w:szCs w:val="18"/>
-              </w:rPr>
-              <w:t>colors</w:t>
+              <w:t>Color palette and store colors</w:t>
             </w:r>
           </w:p>
         </w:tc>
@@ -14232,12 +13350,6 @@
         </w:tc>
       </w:tr>
       <w:tr>
-        <w:tblPrEx>
-          <w:tblCellMar>
-            <w:top w:w="0" w:type="dxa"/>
-            <w:bottom w:w="0" w:type="dxa"/>
-          </w:tblCellMar>
-        </w:tblPrEx>
         <w:trPr>
           <w:cantSplit/>
         </w:trPr>
@@ -14396,12 +13508,6 @@
         </w:tc>
       </w:tr>
       <w:tr>
-        <w:tblPrEx>
-          <w:tblCellMar>
-            <w:top w:w="0" w:type="dxa"/>
-            <w:bottom w:w="0" w:type="dxa"/>
-          </w:tblCellMar>
-        </w:tblPrEx>
         <w:trPr>
           <w:cantSplit/>
         </w:trPr>
@@ -14560,12 +13666,6 @@
         </w:tc>
       </w:tr>
       <w:tr>
-        <w:tblPrEx>
-          <w:tblCellMar>
-            <w:top w:w="0" w:type="dxa"/>
-            <w:bottom w:w="0" w:type="dxa"/>
-          </w:tblCellMar>
-        </w:tblPrEx>
         <w:trPr>
           <w:cantSplit/>
         </w:trPr>
@@ -14724,12 +13824,6 @@
         </w:tc>
       </w:tr>
       <w:tr>
-        <w:tblPrEx>
-          <w:tblCellMar>
-            <w:top w:w="0" w:type="dxa"/>
-            <w:bottom w:w="0" w:type="dxa"/>
-          </w:tblCellMar>
-        </w:tblPrEx>
         <w:trPr>
           <w:cantSplit/>
         </w:trPr>
@@ -14888,12 +13982,6 @@
         </w:tc>
       </w:tr>
       <w:tr>
-        <w:tblPrEx>
-          <w:tblCellMar>
-            <w:top w:w="0" w:type="dxa"/>
-            <w:bottom w:w="0" w:type="dxa"/>
-          </w:tblCellMar>
-        </w:tblPrEx>
         <w:trPr>
           <w:cantSplit/>
         </w:trPr>
@@ -15052,12 +14140,6 @@
         </w:tc>
       </w:tr>
       <w:tr>
-        <w:tblPrEx>
-          <w:tblCellMar>
-            <w:top w:w="0" w:type="dxa"/>
-            <w:bottom w:w="0" w:type="dxa"/>
-          </w:tblCellMar>
-        </w:tblPrEx>
         <w:trPr>
           <w:cantSplit/>
         </w:trPr>
@@ -15216,12 +14298,6 @@
         </w:tc>
       </w:tr>
       <w:tr>
-        <w:tblPrEx>
-          <w:tblCellMar>
-            <w:top w:w="0" w:type="dxa"/>
-            <w:bottom w:w="0" w:type="dxa"/>
-          </w:tblCellMar>
-        </w:tblPrEx>
         <w:trPr>
           <w:cantSplit/>
         </w:trPr>
@@ -15380,12 +14456,6 @@
         </w:tc>
       </w:tr>
       <w:tr>
-        <w:tblPrEx>
-          <w:tblCellMar>
-            <w:top w:w="0" w:type="dxa"/>
-            <w:bottom w:w="0" w:type="dxa"/>
-          </w:tblCellMar>
-        </w:tblPrEx>
         <w:trPr>
           <w:cantSplit/>
         </w:trPr>
@@ -15544,12 +14614,6 @@
         </w:tc>
       </w:tr>
       <w:tr>
-        <w:tblPrEx>
-          <w:tblCellMar>
-            <w:top w:w="0" w:type="dxa"/>
-            <w:bottom w:w="0" w:type="dxa"/>
-          </w:tblCellMar>
-        </w:tblPrEx>
         <w:trPr>
           <w:cantSplit/>
         </w:trPr>
@@ -15708,12 +14772,6 @@
         </w:tc>
       </w:tr>
       <w:tr>
-        <w:tblPrEx>
-          <w:tblCellMar>
-            <w:top w:w="0" w:type="dxa"/>
-            <w:bottom w:w="0" w:type="dxa"/>
-          </w:tblCellMar>
-        </w:tblPrEx>
         <w:trPr>
           <w:cantSplit/>
         </w:trPr>
@@ -15872,12 +14930,6 @@
         </w:tc>
       </w:tr>
       <w:tr>
-        <w:tblPrEx>
-          <w:tblCellMar>
-            <w:top w:w="0" w:type="dxa"/>
-            <w:bottom w:w="0" w:type="dxa"/>
-          </w:tblCellMar>
-        </w:tblPrEx>
         <w:trPr>
           <w:cantSplit/>
         </w:trPr>
@@ -16036,12 +15088,6 @@
         </w:tc>
       </w:tr>
       <w:tr>
-        <w:tblPrEx>
-          <w:tblCellMar>
-            <w:top w:w="0" w:type="dxa"/>
-            <w:bottom w:w="0" w:type="dxa"/>
-          </w:tblCellMar>
-        </w:tblPrEx>
         <w:trPr>
           <w:cantSplit/>
         </w:trPr>
@@ -16200,12 +15246,6 @@
         </w:tc>
       </w:tr>
       <w:tr>
-        <w:tblPrEx>
-          <w:tblCellMar>
-            <w:top w:w="0" w:type="dxa"/>
-            <w:bottom w:w="0" w:type="dxa"/>
-          </w:tblCellMar>
-        </w:tblPrEx>
         <w:trPr>
           <w:cantSplit/>
         </w:trPr>
@@ -16420,12 +15460,6 @@
         <w:gridCol w:w="1960"/>
       </w:tblGrid>
       <w:tr>
-        <w:tblPrEx>
-          <w:tblCellMar>
-            <w:top w:w="0" w:type="dxa"/>
-            <w:bottom w:w="0" w:type="dxa"/>
-          </w:tblCellMar>
-        </w:tblPrEx>
         <w:trPr>
           <w:cantSplit/>
           <w:tblHeader/>
@@ -16568,12 +15602,6 @@
         </w:tc>
       </w:tr>
       <w:tr>
-        <w:tblPrEx>
-          <w:tblCellMar>
-            <w:top w:w="0" w:type="dxa"/>
-            <w:bottom w:w="0" w:type="dxa"/>
-          </w:tblCellMar>
-        </w:tblPrEx>
         <w:trPr>
           <w:cantSplit/>
         </w:trPr>
@@ -16647,23 +15675,7 @@
                 <w:sz w:val="18"/>
                 <w:szCs w:val="18"/>
               </w:rPr>
-              <w:t xml:space="preserve"> come from the shared stylesheet, not </w:t>
-            </w:r>
-            <w:proofErr w:type="gramStart"/>
-            <w:r>
-              <w:rPr>
-                <w:sz w:val="18"/>
-                <w:szCs w:val="18"/>
-              </w:rPr>
-              <w:t>hard-coded</w:t>
-            </w:r>
-            <w:proofErr w:type="gramEnd"/>
-            <w:r>
-              <w:rPr>
-                <w:sz w:val="18"/>
-                <w:szCs w:val="18"/>
-              </w:rPr>
-              <w:t xml:space="preserve"> per chart</w:t>
+              <w:t xml:space="preserve"> come from the shared stylesheet, not hard-coded per chart</w:t>
             </w:r>
           </w:p>
         </w:tc>
@@ -16733,12 +15745,6 @@
         </w:tc>
       </w:tr>
       <w:tr>
-        <w:tblPrEx>
-          <w:tblCellMar>
-            <w:top w:w="0" w:type="dxa"/>
-            <w:bottom w:w="0" w:type="dxa"/>
-          </w:tblCellMar>
-        </w:tblPrEx>
         <w:trPr>
           <w:cantSplit/>
         </w:trPr>
@@ -16868,12 +15874,6 @@
         </w:tc>
       </w:tr>
       <w:tr>
-        <w:tblPrEx>
-          <w:tblCellMar>
-            <w:top w:w="0" w:type="dxa"/>
-            <w:bottom w:w="0" w:type="dxa"/>
-          </w:tblCellMar>
-        </w:tblPrEx>
         <w:trPr>
           <w:cantSplit/>
         </w:trPr>
@@ -16933,23 +15933,7 @@
                 <w:sz w:val="18"/>
                 <w:szCs w:val="18"/>
               </w:rPr>
-              <w:t xml:space="preserve">Filters sit above all charts and one Clear </w:t>
-            </w:r>
-            <w:proofErr w:type="gramStart"/>
-            <w:r>
-              <w:rPr>
-                <w:sz w:val="18"/>
-                <w:szCs w:val="18"/>
-              </w:rPr>
-              <w:t>resets</w:t>
-            </w:r>
-            <w:proofErr w:type="gramEnd"/>
-            <w:r>
-              <w:rPr>
-                <w:sz w:val="18"/>
-                <w:szCs w:val="18"/>
-              </w:rPr>
-              <w:t xml:space="preserve"> everything</w:t>
+              <w:t>Filters sit above all charts and one Clear resets everything</w:t>
             </w:r>
           </w:p>
         </w:tc>
@@ -17019,12 +16003,6 @@
         </w:tc>
       </w:tr>
       <w:tr>
-        <w:tblPrEx>
-          <w:tblCellMar>
-            <w:top w:w="0" w:type="dxa"/>
-            <w:bottom w:w="0" w:type="dxa"/>
-          </w:tblCellMar>
-        </w:tblPrEx>
         <w:trPr>
           <w:cantSplit/>
         </w:trPr>
@@ -17154,12 +16132,6 @@
         </w:tc>
       </w:tr>
       <w:tr>
-        <w:tblPrEx>
-          <w:tblCellMar>
-            <w:top w:w="0" w:type="dxa"/>
-            <w:bottom w:w="0" w:type="dxa"/>
-          </w:tblCellMar>
-        </w:tblPrEx>
         <w:trPr>
           <w:cantSplit/>
         </w:trPr>
@@ -17289,12 +16261,6 @@
         </w:tc>
       </w:tr>
       <w:tr>
-        <w:tblPrEx>
-          <w:tblCellMar>
-            <w:top w:w="0" w:type="dxa"/>
-            <w:bottom w:w="0" w:type="dxa"/>
-          </w:tblCellMar>
-        </w:tblPrEx>
         <w:trPr>
           <w:cantSplit/>
         </w:trPr>
@@ -17440,12 +16406,6 @@
         </w:tc>
       </w:tr>
       <w:tr>
-        <w:tblPrEx>
-          <w:tblCellMar>
-            <w:top w:w="0" w:type="dxa"/>
-            <w:bottom w:w="0" w:type="dxa"/>
-          </w:tblCellMar>
-        </w:tblPrEx>
         <w:trPr>
           <w:cantSplit/>
         </w:trPr>
@@ -17575,12 +16535,6 @@
         </w:tc>
       </w:tr>
       <w:tr>
-        <w:tblPrEx>
-          <w:tblCellMar>
-            <w:top w:w="0" w:type="dxa"/>
-            <w:bottom w:w="0" w:type="dxa"/>
-          </w:tblCellMar>
-        </w:tblPrEx>
         <w:trPr>
           <w:cantSplit/>
         </w:trPr>
@@ -17710,12 +16664,6 @@
         </w:tc>
       </w:tr>
       <w:tr>
-        <w:tblPrEx>
-          <w:tblCellMar>
-            <w:top w:w="0" w:type="dxa"/>
-            <w:bottom w:w="0" w:type="dxa"/>
-          </w:tblCellMar>
-        </w:tblPrEx>
         <w:trPr>
           <w:cantSplit/>
         </w:trPr>
@@ -17845,12 +16793,6 @@
         </w:tc>
       </w:tr>
       <w:tr>
-        <w:tblPrEx>
-          <w:tblCellMar>
-            <w:top w:w="0" w:type="dxa"/>
-            <w:bottom w:w="0" w:type="dxa"/>
-          </w:tblCellMar>
-        </w:tblPrEx>
         <w:trPr>
           <w:cantSplit/>
         </w:trPr>
@@ -17980,12 +16922,6 @@
         </w:tc>
       </w:tr>
       <w:tr>
-        <w:tblPrEx>
-          <w:tblCellMar>
-            <w:top w:w="0" w:type="dxa"/>
-            <w:bottom w:w="0" w:type="dxa"/>
-          </w:tblCellMar>
-        </w:tblPrEx>
         <w:trPr>
           <w:cantSplit/>
         </w:trPr>
@@ -18115,12 +17051,6 @@
         </w:tc>
       </w:tr>
       <w:tr>
-        <w:tblPrEx>
-          <w:tblCellMar>
-            <w:top w:w="0" w:type="dxa"/>
-            <w:bottom w:w="0" w:type="dxa"/>
-          </w:tblCellMar>
-        </w:tblPrEx>
         <w:trPr>
           <w:cantSplit/>
         </w:trPr>
@@ -18306,12 +17236,6 @@
         <w:gridCol w:w="2350"/>
       </w:tblGrid>
       <w:tr>
-        <w:tblPrEx>
-          <w:tblCellMar>
-            <w:top w:w="0" w:type="dxa"/>
-            <w:bottom w:w="0" w:type="dxa"/>
-          </w:tblCellMar>
-        </w:tblPrEx>
         <w:trPr>
           <w:cantSplit/>
           <w:tblHeader/>
@@ -18488,12 +17412,6 @@
         </w:tc>
       </w:tr>
       <w:tr>
-        <w:tblPrEx>
-          <w:tblCellMar>
-            <w:top w:w="0" w:type="dxa"/>
-            <w:bottom w:w="0" w:type="dxa"/>
-          </w:tblCellMar>
-        </w:tblPrEx>
         <w:trPr>
           <w:cantSplit/>
         </w:trPr>
@@ -18558,15 +17476,13 @@
               </w:rPr>
               <w:t xml:space="preserve">Store </w:t>
             </w:r>
-            <w:proofErr w:type="spellStart"/>
-            <w:r>
-              <w:rPr>
-                <w:sz w:val="18"/>
-                <w:szCs w:val="18"/>
-              </w:rPr>
-              <w:t>colours</w:t>
-            </w:r>
-            <w:proofErr w:type="spellEnd"/>
+            <w:r>
+              <w:rPr>
+                <w:sz w:val="18"/>
+                <w:szCs w:val="18"/>
+              </w:rPr>
+              <w:t>colors</w:t>
+            </w:r>
           </w:p>
         </w:tc>
         <w:tc>
@@ -18661,12 +17577,6 @@
         </w:tc>
       </w:tr>
       <w:tr>
-        <w:tblPrEx>
-          <w:tblCellMar>
-            <w:top w:w="0" w:type="dxa"/>
-            <w:bottom w:w="0" w:type="dxa"/>
-          </w:tblCellMar>
-        </w:tblPrEx>
         <w:trPr>
           <w:cantSplit/>
         </w:trPr>
@@ -18759,23 +17669,7 @@
                 <w:sz w:val="18"/>
                 <w:szCs w:val="18"/>
               </w:rPr>
-              <w:t xml:space="preserve">Minutes §6: heat map and store map side by side, scatter plot </w:t>
-            </w:r>
-            <w:proofErr w:type="gramStart"/>
-            <w:r>
-              <w:rPr>
-                <w:sz w:val="18"/>
-                <w:szCs w:val="18"/>
-              </w:rPr>
-              <w:t>full-width</w:t>
-            </w:r>
-            <w:proofErr w:type="gramEnd"/>
-            <w:r>
-              <w:rPr>
-                <w:sz w:val="18"/>
-                <w:szCs w:val="18"/>
-              </w:rPr>
-              <w:t xml:space="preserve"> below</w:t>
+              <w:t>Minutes §6: heat map and store map side by side, scatter plot full-width below</w:t>
             </w:r>
           </w:p>
         </w:tc>
@@ -18805,23 +17699,7 @@
                 <w:sz w:val="18"/>
                 <w:szCs w:val="18"/>
               </w:rPr>
-              <w:t xml:space="preserve">Screenshots: all three charts stacked </w:t>
-            </w:r>
-            <w:proofErr w:type="gramStart"/>
-            <w:r>
-              <w:rPr>
-                <w:sz w:val="18"/>
-                <w:szCs w:val="18"/>
-              </w:rPr>
-              <w:t>full-width</w:t>
-            </w:r>
-            <w:proofErr w:type="gramEnd"/>
-            <w:r>
-              <w:rPr>
-                <w:sz w:val="18"/>
-                <w:szCs w:val="18"/>
-              </w:rPr>
-              <w:t>, each with a side panel</w:t>
+              <w:t>Screenshots: all three charts stacked full-width, each with a side panel</w:t>
             </w:r>
           </w:p>
         </w:tc>
@@ -18857,12 +17735,6 @@
         </w:tc>
       </w:tr>
       <w:tr>
-        <w:tblPrEx>
-          <w:tblCellMar>
-            <w:top w:w="0" w:type="dxa"/>
-            <w:bottom w:w="0" w:type="dxa"/>
-          </w:tblCellMar>
-        </w:tblPrEx>
         <w:trPr>
           <w:cantSplit/>
         </w:trPr>
@@ -19021,12 +17893,6 @@
         </w:tc>
       </w:tr>
       <w:tr>
-        <w:tblPrEx>
-          <w:tblCellMar>
-            <w:top w:w="0" w:type="dxa"/>
-            <w:bottom w:w="0" w:type="dxa"/>
-          </w:tblCellMar>
-        </w:tblPrEx>
         <w:trPr>
           <w:cantSplit/>
         </w:trPr>
@@ -19185,12 +18051,6 @@
         </w:tc>
       </w:tr>
       <w:tr>
-        <w:tblPrEx>
-          <w:tblCellMar>
-            <w:top w:w="0" w:type="dxa"/>
-            <w:bottom w:w="0" w:type="dxa"/>
-          </w:tblCellMar>
-        </w:tblPrEx>
         <w:trPr>
           <w:cantSplit/>
         </w:trPr>
@@ -19349,12 +18209,6 @@
         </w:tc>
       </w:tr>
       <w:tr>
-        <w:tblPrEx>
-          <w:tblCellMar>
-            <w:top w:w="0" w:type="dxa"/>
-            <w:bottom w:w="0" w:type="dxa"/>
-          </w:tblCellMar>
-        </w:tblPrEx>
         <w:trPr>
           <w:cantSplit/>
         </w:trPr>
@@ -19508,34 +18362,12 @@
                 <w:sz w:val="18"/>
                 <w:szCs w:val="18"/>
               </w:rPr>
-              <w:t xml:space="preserve">Required; </w:t>
-            </w:r>
-            <w:proofErr w:type="gramStart"/>
-            <w:r>
-              <w:rPr>
-                <w:sz w:val="18"/>
-                <w:szCs w:val="18"/>
-              </w:rPr>
-              <w:t>confirm</w:t>
-            </w:r>
-            <w:proofErr w:type="gramEnd"/>
-            <w:r>
-              <w:rPr>
-                <w:sz w:val="18"/>
-                <w:szCs w:val="18"/>
-              </w:rPr>
-              <w:t xml:space="preserve"> in build</w:t>
+              <w:t>Required; confirm in build</w:t>
             </w:r>
           </w:p>
         </w:tc>
       </w:tr>
       <w:tr>
-        <w:tblPrEx>
-          <w:tblCellMar>
-            <w:top w:w="0" w:type="dxa"/>
-            <w:bottom w:w="0" w:type="dxa"/>
-          </w:tblCellMar>
-        </w:tblPrEx>
         <w:trPr>
           <w:cantSplit/>
         </w:trPr>
@@ -19694,12 +18526,6 @@
         </w:tc>
       </w:tr>
       <w:tr>
-        <w:tblPrEx>
-          <w:tblCellMar>
-            <w:top w:w="0" w:type="dxa"/>
-            <w:bottom w:w="0" w:type="dxa"/>
-          </w:tblCellMar>
-        </w:tblPrEx>
         <w:trPr>
           <w:cantSplit/>
         </w:trPr>

</xml_diff>